<commit_message>
Strengthen speaker kit bios and diversity positioning
</commit_message>
<xml_diff>
--- a/assets/media/Micheal_Sheehy_Speaker_Media_Kit.docx
+++ b/assets/media/Micheal_Sheehy_Speaker_Media_Kit.docx
@@ -47,7 +47,7 @@
           <w:color w:val="66716B"/>
           <w:sz w:val="28"/>
         </w:rPr>
-        <w:t>Global payments, financial crime, AI governance and executive leadership</w:t>
+        <w:t>Global payments, financial crime, AI governance and inclusive leadership</w:t>
       </w:r>
     </w:p>
     <w:tbl>
@@ -139,7 +139,7 @@
     </w:p>
     <w:p>
       <w:r>
-        <w:t>Micheal Sheehy is a global payments and compliance executive with more than 20 years of experience building financial-crime, regulatory and operating capabilities across international markets. His work connects compliance, technology, customer experience and strategy—especially where static governance is being overtaken by faster-moving risk.</w:t>
+        <w:t>Micheal Sheehy is a global payments and compliance executive with more than 20 years of experience building financial-crime, regulatory and operating capabilities across international markets. His work connects compliance, technology, customer experience and strategy with the human realities of leadership—especially where static governance is being overtaken by faster-moving risk.</w:t>
       </w:r>
     </w:p>
     <w:tbl>
@@ -360,7 +360,7 @@
                 <w:color w:val="66716B"/>
                 <w:sz w:val="19"/>
               </w:rPr>
-              <w:t>Adaptive compliance; global payments; AI and model governance; financial crime; sanctions; KYC; leadership.</w:t>
+              <w:t>Adaptive compliance; global payments; AI and model governance; financial crime; inclusive leadership; LGBTQ+ visibility.</w:t>
             </w:r>
           </w:p>
         </w:tc>
@@ -543,31 +543,108 @@
     </w:p>
     <w:p>
       <w:r>
-        <w:t>Micheal Sheehy is a global payments and compliance executive who writes and speaks about financial crime, artificial intelligence, model governance and the operating models required to scale safely. A Chief Compliance Officer with more than 20 years in financial services, he is the author of the Adaptive Compliance series and a frequent contributor to industry conversations on the future of risk.</w:t>
-      </w:r>
-    </w:p>
-    <w:p>
-      <w:pPr>
-        <w:pStyle w:val="Heading2"/>
-      </w:pPr>
-      <w:r>
-        <w:t>Long bio</w:t>
-      </w:r>
-    </w:p>
-    <w:p>
-      <w:r>
-        <w:t>Micheal Sheehy is a global payments and compliance executive with more than 20 years of experience across financial services and cross-border payments. He has led distributed organizations and transformations spanning financial crime, sanctions, customer lifecycle, transaction monitoring and model governance. His work asks how compliance can become an adaptive operating system that helps global businesses grow safely. Micheal is the author of the eight-volume Adaptive Compliance series.</w:t>
-      </w:r>
-    </w:p>
-    <w:p>
-      <w:r>
-        <w:br w:type="page"/>
+        <w:t>Micheal Sheehy is a global payments and compliance executive with more than 20 years of experience building financial-crime, regulatory and operating capabilities across international markets. A Chief Compliance Officer and author of the Adaptive Compliance series, he writes and speaks about artificial intelligence, payments, model governance and the operating models required to scale safely. Micheal also draws on his experience as a gay executive to explore authenticity, psychological safety and why inclusive leadership improves challenge, escalation and decision-making.</w:t>
       </w:r>
     </w:p>
     <w:p>
       <w:pPr>
         <w:spacing w:before="0" w:after="100"/>
       </w:pPr>
+      <w:r>
+        <w:br w:type="page"/>
+      </w:r>
+      <w:r>
+        <w:rPr>
+          <w:rFonts w:ascii="Calibri" w:hAnsi="Calibri"/>
+          <w:b/>
+          <w:i w:val="0"/>
+          <w:color w:val="738125"/>
+          <w:sz w:val="17"/>
+        </w:rPr>
+        <w:t>LONG BIOGRAPHY</w:t>
+      </w:r>
+    </w:p>
+    <w:p>
+      <w:pPr>
+        <w:pStyle w:val="Heading1"/>
+      </w:pPr>
+      <w:r>
+        <w:t>A global operator—and a deeply human leader</w:t>
+      </w:r>
+    </w:p>
+    <w:p>
+      <w:r>
+        <w:t>Micheal Sheehy is a global payments and compliance executive with more than 20 years of experience across financial services and cross-border payments. As a Chief Compliance Officer, he has built and led large, distributed teams and major transformation programs spanning financial crime, sanctions, customer lifecycle management, transaction monitoring, fraud, artificial intelligence and model governance.</w:t>
+      </w:r>
+    </w:p>
+    <w:p>
+      <w:r>
+        <w:t>His work sits where regulation, technology, customer experience and operating strategy meet. He is particularly interested in the gap between a control that looks impressive in a presentation and one that continues to work when the data is incomplete, the threat changes and the business is moving. His talks turn that tension into practical questions for boards, executives and operators: who owns the decision, what evidence travels with it, what should remain human and how quickly can the system learn?</w:t>
+      </w:r>
+    </w:p>
+    <w:p>
+      <w:r>
+        <w:t>Born in the United Kingdom, raised in Ireland and now based in New York, Micheal brings a genuinely global perspective to leadership. Growing up gay in Ireland when homosexuality was still criminalized taught him early how to read a room, how much energy people spend editing themselves and how humor can open a door that hierarchy keeps closed. Those experiences now shape his view that inclusion is not a side program. It is part of how organizations hear bad news early, make dissent safe and improve the quality of judgment.</w:t>
+      </w:r>
+    </w:p>
+    <w:p>
+      <w:r>
+        <w:t>Micheal is the author of the eight-volume Adaptive Compliance series, which argues that compliance should operate as an adaptive system rather than a collection of periodic controls. He writes and speaks on AI-enabled financial crime, payment transparency, stablecoins, global compliance operating models, transformation and the personal realities of senior accountability. His style is direct, evidence-led and practical, with enough wit to remind an audience that governance is a serious subject—not a punishment.</w:t>
+      </w:r>
+    </w:p>
+    <w:tbl>
+      <w:tblPr>
+        <w:tblW w:type="dxa" w:w="9360"/>
+        <w:jc w:val="left"/>
+        <w:tblLayout w:type="fixed"/>
+        <w:tblLook w:firstColumn="1" w:firstRow="1" w:lastColumn="0" w:lastRow="0" w:noHBand="0" w:noVBand="1" w:val="04A0"/>
+        <w:tblInd w:w="120" w:type="dxa"/>
+      </w:tblPr>
+      <w:tblGrid>
+        <w:gridCol w:w="9360"/>
+      </w:tblGrid>
+      <w:tr>
+        <w:tc>
+          <w:tcPr>
+            <w:tcW w:type="dxa" w:w="9360"/>
+            <w:tcMar>
+              <w:top w:w="180" w:type="dxa"/>
+              <w:start w:w="220" w:type="dxa"/>
+              <w:bottom w:w="180" w:type="dxa"/>
+              <w:end w:w="220" w:type="dxa"/>
+            </w:tcMar>
+            <w:shd w:fill="F0F3DF"/>
+          </w:tcPr>
+          <w:p>
+            <w:pPr>
+              <w:spacing w:after="0"/>
+            </w:pPr>
+            <w:r>
+              <w:rPr>
+                <w:rFonts w:ascii="Georgia" w:hAnsi="Georgia"/>
+                <w:b w:val="0"/>
+                <w:i w:val="0"/>
+                <w:color w:val="192720"/>
+                <w:sz w:val="26"/>
+              </w:rPr>
+              <w:t>The strongest cultures make it safe to speak before certainty—and impossible to hide behind silence.</w:t>
+            </w:r>
+          </w:p>
+        </w:tc>
+      </w:tr>
+    </w:tbl>
+    <w:p>
+      <w:pPr>
+        <w:spacing w:after="0"/>
+      </w:pPr>
+    </w:p>
+    <w:p>
+      <w:pPr>
+        <w:spacing w:before="0" w:after="100"/>
+      </w:pPr>
+      <w:r>
+        <w:br w:type="page"/>
+      </w:r>
       <w:r>
         <w:rPr>
           <w:rFonts w:ascii="Calibri" w:hAnsi="Calibri"/>
@@ -692,12 +769,12 @@
         <w:pStyle w:val="Heading2"/>
       </w:pPr>
       <w:r>
-        <w:t>Your New Platform Is Not a Transformation</w:t>
+        <w:t>Authenticity Is a Leadership Control</w:t>
       </w:r>
     </w:p>
     <w:p>
       <w:r>
-        <w:t>A candid account of why buying technology is the easy part—and why data, process, governance, adoption and ownership determine the outcome.</w:t>
+        <w:t>What growing up gay in Ireland taught Micheal about reading rooms, using humor and the organizational cost of making people edit themselves.</w:t>
       </w:r>
     </w:p>
     <w:p>
@@ -709,18 +786,41 @@
           <w:color w:val="738125"/>
           <w:sz w:val="20"/>
         </w:rPr>
-        <w:t>Audience leaves with: a transformation scorecard, coexistence controls and questions to ask before signing the next contract.</w:t>
+        <w:t>Audience leaves with: practical ways to make challenge and escalation safer, without lowering standards or accountability.</w:t>
       </w:r>
     </w:p>
     <w:p>
+      <w:pPr>
+        <w:spacing w:before="100"/>
+      </w:pPr>
       <w:r>
-        <w:br w:type="page"/>
+        <w:rPr>
+          <w:rFonts w:ascii="Calibri" w:hAnsi="Calibri"/>
+          <w:b/>
+          <w:i w:val="0"/>
+          <w:color w:val="192720"/>
+          <w:sz w:val="19"/>
+        </w:rPr>
+        <w:t xml:space="preserve">Also available: </w:t>
+      </w:r>
+      <w:r>
+        <w:rPr>
+          <w:rFonts w:ascii="Calibri" w:hAnsi="Calibri"/>
+          <w:b w:val="0"/>
+          <w:i w:val="0"/>
+          <w:color w:val="66716B"/>
+          <w:sz w:val="19"/>
+        </w:rPr>
+        <w:t>compliance transformation, stablecoins, de-risking, sanctions, model management and executive accountability.</w:t>
       </w:r>
     </w:p>
     <w:p>
       <w:pPr>
         <w:spacing w:before="0" w:after="100"/>
       </w:pPr>
+      <w:r>
+        <w:br w:type="page"/>
+      </w:r>
       <w:r>
         <w:rPr>
           <w:rFonts w:ascii="Calibri" w:hAnsi="Calibri"/>
@@ -1182,7 +1282,7 @@
                 <w:color w:val="192720"/>
                 <w:sz w:val="26"/>
               </w:rPr>
-              <w:t>Micheal Sheehy is a global payments and compliance executive with more than 20 years of experience building financial-crime and regulatory capabilities across international markets. He is the author of the Adaptive Compliance series and writes about AI, payments, model governance and the leadership choices required to scale safely. Please welcome Micheal Sheehy.</w:t>
+              <w:t>Micheal Sheehy is a global payments and compliance executive with more than 20 years of experience building financial-crime and regulatory capabilities across international markets. He is the author of the Adaptive Compliance series and writes about AI, payments, model governance, inclusive leadership and the choices required to scale safely. Please welcome Micheal Sheehy.</w:t>
             </w:r>
           </w:p>
         </w:tc>
@@ -1230,18 +1330,16 @@
         <w:pStyle w:val="ListBullet"/>
       </w:pPr>
       <w:r>
-        <w:t>Why is payment-message quality becoming a financial-crime control?</w:t>
-      </w:r>
-    </w:p>
-    <w:p>
-      <w:r>
-        <w:br w:type="page"/>
+        <w:t>What did growing up gay in Ireland teach you about silence, belonging and the duty of a leader?</w:t>
       </w:r>
     </w:p>
     <w:p>
       <w:pPr>
         <w:spacing w:before="0" w:after="100"/>
       </w:pPr>
+      <w:r>
+        <w:br w:type="page"/>
+      </w:r>
       <w:r>
         <w:rPr>
           <w:rFonts w:ascii="Calibri" w:hAnsi="Calibri"/>
@@ -1670,7 +1768,7 @@
     </w:p>
     <w:p>
       <w:r>
-        <w:t>Micheal’s writing at michealsheehy.com includes the eight-volume Adaptive Compliance series, essays on North Korean IT-worker networks, global KYC, stablecoins, payment transparency, de-risking, AI-enabled financial crime and personal leadership.</w:t>
+        <w:t>Micheal’s writing at michealsheehy.com includes the eight-volume Adaptive Compliance series, essays on North Korean IT-worker networks, global KYC, stablecoins, payment transparency, de-risking, AI-enabled financial crime, inclusive leadership and the experience of finding an authentic executive voice.</w:t>
       </w:r>
     </w:p>
     <w:tbl>
@@ -1720,14 +1818,12 @@
       </w:pPr>
     </w:p>
     <w:p>
+      <w:pPr>
+        <w:spacing w:before="0" w:after="100"/>
+      </w:pPr>
       <w:r>
         <w:br w:type="page"/>
       </w:r>
-    </w:p>
-    <w:p>
-      <w:pPr>
-        <w:spacing w:before="0" w:after="100"/>
-      </w:pPr>
       <w:r>
         <w:rPr>
           <w:rFonts w:ascii="Calibri" w:hAnsi="Calibri"/>
@@ -2010,14 +2106,12 @@
       </w:r>
     </w:p>
     <w:p>
+      <w:pPr>
+        <w:spacing w:before="0" w:after="100"/>
+      </w:pPr>
       <w:r>
         <w:br w:type="page"/>
       </w:r>
-    </w:p>
-    <w:p>
-      <w:pPr>
-        <w:spacing w:before="0" w:after="100"/>
-      </w:pPr>
       <w:r>
         <w:rPr>
           <w:rFonts w:ascii="Calibri" w:hAnsi="Calibri"/>

</xml_diff>